<commit_message>
feat: demo database partitioning (horizontal, vertical, functional) with MySQL + Spring Boot
</commit_message>
<xml_diff>
--- a/Tuan6/MinhChungTuan6.docx
+++ b/Tuan6/MinhChungTuan6.docx
@@ -39,6 +39,8 @@
         </w:rPr>
         <w:t xml:space="preserve"> 6:</w:t>
       </w:r>
+      <w:bookmarkStart w:id="0" w:name="_GoBack"/>
+      <w:bookmarkEnd w:id="0"/>
     </w:p>
     <w:p>
       <w:pPr>
@@ -72,10 +74,10 @@
           <w:szCs w:val="28"/>
         </w:rPr>
       </w:pPr>
-      <w:bookmarkStart w:id="0" w:name="_GoBack"/>
-      <w:r>
-        <w:rPr>
-          <w:rFonts w:ascii="Times New Roman" w:hAnsi="Times New Roman" w:cs="Times New Roman"/>
+      <w:r>
+        <w:rPr>
+          <w:rFonts w:ascii="Times New Roman" w:hAnsi="Times New Roman" w:cs="Times New Roman"/>
+          <w:noProof/>
           <w:sz w:val="28"/>
           <w:szCs w:val="28"/>
         </w:rPr>
@@ -115,19 +117,19 @@
           </wp:inline>
         </w:drawing>
       </w:r>
-      <w:bookmarkEnd w:id="0"/>
-    </w:p>
-    <w:p>
-      <w:pPr>
-        <w:rPr>
-          <w:rFonts w:ascii="Times New Roman" w:hAnsi="Times New Roman" w:cs="Times New Roman"/>
-          <w:sz w:val="28"/>
-          <w:szCs w:val="28"/>
-        </w:rPr>
-      </w:pPr>
-      <w:r>
-        <w:rPr>
-          <w:rFonts w:ascii="Times New Roman" w:hAnsi="Times New Roman" w:cs="Times New Roman"/>
+    </w:p>
+    <w:p>
+      <w:pPr>
+        <w:rPr>
+          <w:rFonts w:ascii="Times New Roman" w:hAnsi="Times New Roman" w:cs="Times New Roman"/>
+          <w:sz w:val="28"/>
+          <w:szCs w:val="28"/>
+        </w:rPr>
+      </w:pPr>
+      <w:r>
+        <w:rPr>
+          <w:rFonts w:ascii="Times New Roman" w:hAnsi="Times New Roman" w:cs="Times New Roman"/>
+          <w:noProof/>
           <w:sz w:val="28"/>
           <w:szCs w:val="28"/>
         </w:rPr>
@@ -179,6 +181,7 @@
       <w:r>
         <w:rPr>
           <w:rFonts w:ascii="Times New Roman" w:hAnsi="Times New Roman" w:cs="Times New Roman"/>
+          <w:noProof/>
           <w:sz w:val="28"/>
           <w:szCs w:val="28"/>
         </w:rPr>
@@ -230,6 +233,7 @@
       <w:r>
         <w:rPr>
           <w:rFonts w:ascii="Times New Roman" w:hAnsi="Times New Roman" w:cs="Times New Roman"/>
+          <w:noProof/>
           <w:sz w:val="28"/>
           <w:szCs w:val="28"/>
         </w:rPr>
@@ -315,6 +319,7 @@
       <w:r>
         <w:rPr>
           <w:rFonts w:ascii="Times New Roman" w:hAnsi="Times New Roman" w:cs="Times New Roman"/>
+          <w:noProof/>
           <w:sz w:val="28"/>
           <w:szCs w:val="28"/>
         </w:rPr>
@@ -728,15 +733,7 @@
           <w:sz w:val="28"/>
           <w:szCs w:val="28"/>
         </w:rPr>
-        <w:t>Multi-stage giảm được 43% kích thước so vớ</w:t>
-      </w:r>
-      <w:r>
-        <w:rPr>
-          <w:rFonts w:ascii="Times New Roman" w:hAnsi="Times New Roman" w:cs="Times New Roman"/>
-          <w:sz w:val="28"/>
-          <w:szCs w:val="28"/>
-        </w:rPr>
-        <w:t>i single-stage.</w:t>
+        <w:t>Multi-stage giảm được 43% kích thước so với single-stage.</w:t>
       </w:r>
     </w:p>
     <w:p>
@@ -823,6 +820,7 @@
       <w:r>
         <w:rPr>
           <w:rFonts w:ascii="Times New Roman" w:hAnsi="Times New Roman" w:cs="Times New Roman"/>
+          <w:noProof/>
           <w:sz w:val="28"/>
           <w:szCs w:val="28"/>
         </w:rPr>
@@ -953,6 +951,7 @@
       <w:r>
         <w:rPr>
           <w:rFonts w:ascii="Times New Roman" w:hAnsi="Times New Roman" w:cs="Times New Roman"/>
+          <w:noProof/>
           <w:sz w:val="28"/>
           <w:szCs w:val="28"/>
         </w:rPr>

</xml_diff>